<commit_message>
AJUSTADO PARA 40 MM
AJUSTADO PARA 40 MM
</commit_message>
<xml_diff>
--- a/template_pisf-ATERRO.docx
+++ b/template_pisf-ATERRO.docx
@@ -109,21 +109,7 @@
         <w:rPr>
           <w:rFonts w:ascii="Aptos Narrow" w:hAnsi="Aptos Narrow"/>
         </w:rPr>
-        <w:t xml:space="preserve"> </w:t>
-      </w:r>
-      <w:proofErr w:type="gramStart"/>
-      <w:r>
-        <w:rPr>
-          <w:rFonts w:ascii="Aptos Narrow" w:hAnsi="Aptos Narrow"/>
-        </w:rPr>
-        <w:t>{{ PROPRIETARIO</w:t>
-      </w:r>
-      <w:proofErr w:type="gramEnd"/>
-      <w:r>
-        <w:rPr>
-          <w:rFonts w:ascii="Aptos Narrow" w:hAnsi="Aptos Narrow"/>
-        </w:rPr>
-        <w:t xml:space="preserve"> }}</w:t>
+        <w:t xml:space="preserve"> {{ PROPRIETARIO }}</w:t>
       </w:r>
     </w:p>
     <w:p>
@@ -180,21 +166,7 @@
         <w:rPr>
           <w:rFonts w:ascii="Aptos Narrow" w:hAnsi="Aptos Narrow"/>
         </w:rPr>
-        <w:t xml:space="preserve"> </w:t>
-      </w:r>
-      <w:proofErr w:type="gramStart"/>
-      <w:r>
-        <w:rPr>
-          <w:rFonts w:ascii="Aptos Narrow" w:hAnsi="Aptos Narrow"/>
-        </w:rPr>
-        <w:t>{{ CONTRATO</w:t>
-      </w:r>
-      <w:proofErr w:type="gramEnd"/>
-      <w:r>
-        <w:rPr>
-          <w:rFonts w:ascii="Aptos Narrow" w:hAnsi="Aptos Narrow"/>
-        </w:rPr>
-        <w:t xml:space="preserve"> }}</w:t>
+        <w:t xml:space="preserve"> {{ CONTRATO }}</w:t>
       </w:r>
     </w:p>
     <w:p>
@@ -219,21 +191,7 @@
         <w:rPr>
           <w:rFonts w:ascii="Aptos Narrow" w:hAnsi="Aptos Narrow"/>
         </w:rPr>
-        <w:t xml:space="preserve"> </w:t>
-      </w:r>
-      <w:proofErr w:type="gramStart"/>
-      <w:r>
-        <w:rPr>
-          <w:rFonts w:ascii="Aptos Narrow" w:hAnsi="Aptos Narrow"/>
-        </w:rPr>
-        <w:t>{{ MUNICIPIO</w:t>
-      </w:r>
-      <w:proofErr w:type="gramEnd"/>
-      <w:r>
-        <w:rPr>
-          <w:rFonts w:ascii="Aptos Narrow" w:hAnsi="Aptos Narrow"/>
-        </w:rPr>
-        <w:t xml:space="preserve"> }}</w:t>
+        <w:t xml:space="preserve"> {{ MUNICIPIO }}</w:t>
       </w:r>
     </w:p>
     <w:p>
@@ -260,67 +218,17 @@
         </w:rPr>
         <w:t xml:space="preserve"> </w:t>
       </w:r>
-      <w:proofErr w:type="gramStart"/>
       <w:r>
         <w:rPr>
           <w:rFonts w:ascii="Aptos Narrow" w:hAnsi="Aptos Narrow"/>
         </w:rPr>
-        <w:t>{{ EIXO</w:t>
-      </w:r>
-      <w:proofErr w:type="gramEnd"/>
-      <w:r>
-        <w:rPr>
-          <w:rFonts w:ascii="Aptos Narrow" w:hAnsi="Aptos Narrow"/>
-        </w:rPr>
-        <w:t xml:space="preserve"> }} - </w:t>
+        <w:t xml:space="preserve">{{ EIXO }} - </w:t>
       </w:r>
       <w:r>
         <w:rPr>
           <w:rFonts w:ascii="Aptos Narrow" w:hAnsi="Aptos Narrow"/>
         </w:rPr>
-        <w:t xml:space="preserve">Estaca </w:t>
-      </w:r>
-      <w:proofErr w:type="gramStart"/>
-      <w:r>
-        <w:rPr>
-          <w:rFonts w:ascii="Aptos Narrow" w:hAnsi="Aptos Narrow"/>
-        </w:rPr>
-        <w:t>{{ ESTACA</w:t>
-      </w:r>
-      <w:proofErr w:type="gramEnd"/>
-      <w:r>
-        <w:rPr>
-          <w:rFonts w:ascii="Aptos Narrow" w:hAnsi="Aptos Narrow"/>
-        </w:rPr>
-        <w:t xml:space="preserve"> </w:t>
-      </w:r>
-      <w:proofErr w:type="gramStart"/>
-      <w:r>
-        <w:rPr>
-          <w:rFonts w:ascii="Aptos Narrow" w:hAnsi="Aptos Narrow"/>
-        </w:rPr>
-        <w:t>}}  —</w:t>
-      </w:r>
-      <w:proofErr w:type="gramEnd"/>
-      <w:r>
-        <w:rPr>
-          <w:rFonts w:ascii="Aptos Narrow" w:hAnsi="Aptos Narrow"/>
-        </w:rPr>
-        <w:t xml:space="preserve"> Lado: </w:t>
-      </w:r>
-      <w:proofErr w:type="gramStart"/>
-      <w:r>
-        <w:rPr>
-          <w:rFonts w:ascii="Aptos Narrow" w:hAnsi="Aptos Narrow"/>
-        </w:rPr>
-        <w:t>{{ LADO</w:t>
-      </w:r>
-      <w:proofErr w:type="gramEnd"/>
-      <w:r>
-        <w:rPr>
-          <w:rFonts w:ascii="Aptos Narrow" w:hAnsi="Aptos Narrow"/>
-        </w:rPr>
-        <w:t xml:space="preserve"> }}</w:t>
+        <w:t>Estaca {{ ESTACA }}  — Lado: {{ LADO }}</w:t>
       </w:r>
     </w:p>
     <w:p>
@@ -379,21 +287,7 @@
         <w:rPr>
           <w:rFonts w:ascii="Aptos Narrow" w:hAnsi="Aptos Narrow"/>
         </w:rPr>
-        <w:t xml:space="preserve">: </w:t>
-      </w:r>
-      <w:proofErr w:type="gramStart"/>
-      <w:r>
-        <w:rPr>
-          <w:rFonts w:ascii="Aptos Narrow" w:hAnsi="Aptos Narrow"/>
-        </w:rPr>
-        <w:t>{{ LAT</w:t>
-      </w:r>
-      <w:proofErr w:type="gramEnd"/>
-      <w:r>
-        <w:rPr>
-          <w:rFonts w:ascii="Aptos Narrow" w:hAnsi="Aptos Narrow"/>
-        </w:rPr>
-        <w:t xml:space="preserve"> }} / </w:t>
+        <w:t xml:space="preserve">: {{ LAT }} / </w:t>
       </w:r>
       <w:r>
         <w:rPr>
@@ -405,21 +299,7 @@
         <w:rPr>
           <w:rFonts w:ascii="Aptos Narrow" w:hAnsi="Aptos Narrow"/>
         </w:rPr>
-        <w:t xml:space="preserve">: </w:t>
-      </w:r>
-      <w:proofErr w:type="gramStart"/>
-      <w:r>
-        <w:rPr>
-          <w:rFonts w:ascii="Aptos Narrow" w:hAnsi="Aptos Narrow"/>
-        </w:rPr>
-        <w:t>{{ LONG</w:t>
-      </w:r>
-      <w:proofErr w:type="gramEnd"/>
-      <w:r>
-        <w:rPr>
-          <w:rFonts w:ascii="Aptos Narrow" w:hAnsi="Aptos Narrow"/>
-        </w:rPr>
-        <w:t xml:space="preserve"> }}</w:t>
+        <w:t>: {{ LONG }}</w:t>
       </w:r>
     </w:p>
     <w:p>
@@ -444,35 +324,7 @@
         <w:rPr>
           <w:rFonts w:ascii="Aptos Narrow" w:hAnsi="Aptos Narrow"/>
         </w:rPr>
-        <w:t xml:space="preserve"> </w:t>
-      </w:r>
-      <w:proofErr w:type="gramStart"/>
-      <w:r>
-        <w:rPr>
-          <w:rFonts w:ascii="Aptos Narrow" w:hAnsi="Aptos Narrow"/>
-        </w:rPr>
-        <w:t>{{ USO</w:t>
-      </w:r>
-      <w:proofErr w:type="gramEnd"/>
-      <w:r>
-        <w:rPr>
-          <w:rFonts w:ascii="Aptos Narrow" w:hAnsi="Aptos Narrow"/>
-        </w:rPr>
-        <w:t>_DA_</w:t>
-      </w:r>
-      <w:proofErr w:type="gramStart"/>
-      <w:r>
-        <w:rPr>
-          <w:rFonts w:ascii="Aptos Narrow" w:hAnsi="Aptos Narrow"/>
-        </w:rPr>
-        <w:t>AGUA }</w:t>
-      </w:r>
-      <w:proofErr w:type="gramEnd"/>
-      <w:r>
-        <w:rPr>
-          <w:rFonts w:ascii="Aptos Narrow" w:hAnsi="Aptos Narrow"/>
-        </w:rPr>
-        <w:t xml:space="preserve">} | </w:t>
+        <w:t xml:space="preserve"> {{ USO_DA_AGUA }} | </w:t>
       </w:r>
       <w:r>
         <w:rPr>
@@ -488,7 +340,6 @@
         </w:rPr>
         <w:t xml:space="preserve"> </w:t>
       </w:r>
-      <w:proofErr w:type="gramStart"/>
       <w:r>
         <w:rPr>
           <w:rFonts w:ascii="Aptos Narrow" w:hAnsi="Aptos Narrow"/>
@@ -496,17 +347,7 @@
           <w:bCs/>
           <w:color w:val="EE0000"/>
         </w:rPr>
-        <w:t>{{ SISTEMA</w:t>
-      </w:r>
-      <w:proofErr w:type="gramEnd"/>
-      <w:r>
-        <w:rPr>
-          <w:rFonts w:ascii="Aptos Narrow" w:hAnsi="Aptos Narrow"/>
-          <w:b/>
-          <w:bCs/>
-          <w:color w:val="EE0000"/>
-        </w:rPr>
-        <w:t xml:space="preserve"> }}</w:t>
+        <w:t>{{ SISTEMA }}</w:t>
       </w:r>
     </w:p>
     <w:p>
@@ -531,35 +372,7 @@
         <w:rPr>
           <w:rFonts w:ascii="Aptos Narrow" w:hAnsi="Aptos Narrow"/>
         </w:rPr>
-        <w:t xml:space="preserve"> </w:t>
-      </w:r>
-      <w:proofErr w:type="gramStart"/>
-      <w:r>
-        <w:rPr>
-          <w:rFonts w:ascii="Aptos Narrow" w:hAnsi="Aptos Narrow"/>
-        </w:rPr>
-        <w:t>{{ ESTRUTURA</w:t>
-      </w:r>
-      <w:proofErr w:type="gramEnd"/>
-      <w:r>
-        <w:rPr>
-          <w:rFonts w:ascii="Aptos Narrow" w:hAnsi="Aptos Narrow"/>
-        </w:rPr>
-        <w:t>_</w:t>
-      </w:r>
-      <w:proofErr w:type="gramStart"/>
-      <w:r>
-        <w:rPr>
-          <w:rFonts w:ascii="Aptos Narrow" w:hAnsi="Aptos Narrow"/>
-        </w:rPr>
-        <w:t>WBS }</w:t>
-      </w:r>
-      <w:proofErr w:type="gramEnd"/>
-      <w:r>
-        <w:rPr>
-          <w:rFonts w:ascii="Aptos Narrow" w:hAnsi="Aptos Narrow"/>
-        </w:rPr>
-        <w:t>}.</w:t>
+        <w:t xml:space="preserve"> {{ ESTRUTURA_WBS }}.</w:t>
       </w:r>
     </w:p>
     <w:p>
@@ -1846,7 +1659,15 @@
                 <w:sz w:val="18"/>
                 <w:szCs w:val="18"/>
               </w:rPr>
-              <w:t>HIDRÔMETRO MEDIDOR 1.1/4” Ø 31,75mm</w:t>
+              <w:t xml:space="preserve">HIDRÔMETRO MEDIDOR 1.1/4” Ø </w:t>
+            </w:r>
+            <w:r>
+              <w:rPr>
+                <w:rFonts w:ascii="Calibri" w:hAnsi="Calibri" w:cs="Calibri"/>
+                <w:sz w:val="18"/>
+                <w:szCs w:val="18"/>
+              </w:rPr>
+              <w:t>40MM</w:t>
             </w:r>
           </w:p>
         </w:tc>
@@ -2210,7 +2031,23 @@
                 <w:sz w:val="18"/>
                 <w:szCs w:val="18"/>
               </w:rPr>
-              <w:t>MANGUEIRA MANGOTE 1.1/4” Ø 31,75mm - VARIAVEL</w:t>
+              <w:t xml:space="preserve">MANGUEIRA MANGOTE 1.1/4” Ø </w:t>
+            </w:r>
+            <w:r>
+              <w:rPr>
+                <w:rFonts w:ascii="Calibri" w:hAnsi="Calibri" w:cs="Calibri"/>
+                <w:sz w:val="18"/>
+                <w:szCs w:val="18"/>
+              </w:rPr>
+              <w:t>40MM</w:t>
+            </w:r>
+            <w:r>
+              <w:rPr>
+                <w:rFonts w:ascii="Calibri" w:hAnsi="Calibri" w:cs="Calibri"/>
+                <w:sz w:val="18"/>
+                <w:szCs w:val="18"/>
+              </w:rPr>
+              <w:t xml:space="preserve"> (variável)</w:t>
             </w:r>
           </w:p>
         </w:tc>
@@ -2246,7 +2083,7 @@
                 <w:sz w:val="18"/>
                 <w:szCs w:val="18"/>
               </w:rPr>
-              <w:t> 18</w:t>
+              <w:t> </w:t>
             </w:r>
           </w:p>
         </w:tc>
@@ -4630,7 +4467,7 @@
                 <w:sz w:val="18"/>
                 <w:szCs w:val="18"/>
               </w:rPr>
-              <w:t>FITA VEDA ROSCA 18MM X 50MM</w:t>
+              <w:t>FITA VEDA ROSCA 18MM X 50M</w:t>
             </w:r>
           </w:p>
         </w:tc>
@@ -5540,7 +5377,23 @@
                 <w:sz w:val="18"/>
                 <w:szCs w:val="18"/>
               </w:rPr>
-              <w:t>ADAPTADOR 40mm x 1.1/4” SOLD SAÍDA DENTADA P/ MANGUEIRA</w:t>
+              <w:t>ADAPTADOR 40</w:t>
+            </w:r>
+            <w:r>
+              <w:rPr>
+                <w:rFonts w:ascii="Calibri" w:hAnsi="Calibri" w:cs="Calibri"/>
+                <w:sz w:val="18"/>
+                <w:szCs w:val="18"/>
+              </w:rPr>
+              <w:t>MM</w:t>
+            </w:r>
+            <w:r>
+              <w:rPr>
+                <w:rFonts w:ascii="Calibri" w:hAnsi="Calibri" w:cs="Calibri"/>
+                <w:sz w:val="18"/>
+                <w:szCs w:val="18"/>
+              </w:rPr>
+              <w:t xml:space="preserve"> x 1.1/4” SOLD SAÍDA DENTADA P/ MANGUEIRA</w:t>
             </w:r>
           </w:p>
         </w:tc>
@@ -5995,139 +5848,31 @@
                 <w:sz w:val="20"/>
                 <w:szCs w:val="20"/>
               </w:rPr>
-              <w:t xml:space="preserve">Foto 1: Ponto de captação na Estaca </w:t>
-            </w:r>
-            <w:proofErr w:type="gramStart"/>
-            <w:r>
+              <w:t>Foto 1: Ponto de captação na Estaca {{ ESTACA }}  — Lado: {{ LADO }}.</w:t>
+            </w:r>
+          </w:p>
+        </w:tc>
+        <w:tc>
+          <w:tcPr>
+            <w:tcW w:w="4819" w:type="dxa"/>
+          </w:tcPr>
+          <w:p>
+            <w:pPr>
+              <w:shd w:val="clear" w:color="auto" w:fill="FFFFFF" w:themeFill="background1"/>
+              <w:spacing w:after="0"/>
               <w:rPr>
                 <w:i/>
                 <w:sz w:val="20"/>
                 <w:szCs w:val="20"/>
               </w:rPr>
-              <w:t>{{ ESTACA</w:t>
-            </w:r>
-            <w:proofErr w:type="gramEnd"/>
+            </w:pPr>
             <w:r>
               <w:rPr>
                 <w:i/>
                 <w:sz w:val="20"/>
                 <w:szCs w:val="20"/>
               </w:rPr>
-              <w:t xml:space="preserve"> </w:t>
-            </w:r>
-            <w:proofErr w:type="gramStart"/>
-            <w:r>
-              <w:rPr>
-                <w:i/>
-                <w:sz w:val="20"/>
-                <w:szCs w:val="20"/>
-              </w:rPr>
-              <w:t>}}  —</w:t>
-            </w:r>
-            <w:proofErr w:type="gramEnd"/>
-            <w:r>
-              <w:rPr>
-                <w:i/>
-                <w:sz w:val="20"/>
-                <w:szCs w:val="20"/>
-              </w:rPr>
-              <w:t xml:space="preserve"> Lado: </w:t>
-            </w:r>
-            <w:proofErr w:type="gramStart"/>
-            <w:r>
-              <w:rPr>
-                <w:i/>
-                <w:sz w:val="20"/>
-                <w:szCs w:val="20"/>
-              </w:rPr>
-              <w:t>{{ LADO</w:t>
-            </w:r>
-            <w:proofErr w:type="gramEnd"/>
-            <w:r>
-              <w:rPr>
-                <w:i/>
-                <w:sz w:val="20"/>
-                <w:szCs w:val="20"/>
-              </w:rPr>
-              <w:t xml:space="preserve"> }}.</w:t>
-            </w:r>
-          </w:p>
-        </w:tc>
-        <w:tc>
-          <w:tcPr>
-            <w:tcW w:w="4819" w:type="dxa"/>
-          </w:tcPr>
-          <w:p>
-            <w:pPr>
-              <w:shd w:val="clear" w:color="auto" w:fill="FFFFFF" w:themeFill="background1"/>
-              <w:spacing w:after="0"/>
-              <w:rPr>
-                <w:i/>
-                <w:sz w:val="20"/>
-                <w:szCs w:val="20"/>
-              </w:rPr>
-            </w:pPr>
-            <w:r>
-              <w:rPr>
-                <w:i/>
-                <w:sz w:val="20"/>
-                <w:szCs w:val="20"/>
-              </w:rPr>
-              <w:t xml:space="preserve">Foto 2: Ponto de captação na Estaca </w:t>
-            </w:r>
-            <w:proofErr w:type="gramStart"/>
-            <w:r>
-              <w:rPr>
-                <w:i/>
-                <w:sz w:val="20"/>
-                <w:szCs w:val="20"/>
-              </w:rPr>
-              <w:t>{{ ESTACA</w:t>
-            </w:r>
-            <w:proofErr w:type="gramEnd"/>
-            <w:r>
-              <w:rPr>
-                <w:i/>
-                <w:sz w:val="20"/>
-                <w:szCs w:val="20"/>
-              </w:rPr>
-              <w:t xml:space="preserve"> </w:t>
-            </w:r>
-            <w:proofErr w:type="gramStart"/>
-            <w:r>
-              <w:rPr>
-                <w:i/>
-                <w:sz w:val="20"/>
-                <w:szCs w:val="20"/>
-              </w:rPr>
-              <w:t>}}  —</w:t>
-            </w:r>
-            <w:proofErr w:type="gramEnd"/>
-            <w:r>
-              <w:rPr>
-                <w:i/>
-                <w:sz w:val="20"/>
-                <w:szCs w:val="20"/>
-              </w:rPr>
-              <w:t xml:space="preserve"> Lado: </w:t>
-            </w:r>
-            <w:proofErr w:type="gramStart"/>
-            <w:r>
-              <w:rPr>
-                <w:i/>
-                <w:sz w:val="20"/>
-                <w:szCs w:val="20"/>
-              </w:rPr>
-              <w:t>{{ LADO</w:t>
-            </w:r>
-            <w:proofErr w:type="gramEnd"/>
-            <w:r>
-              <w:rPr>
-                <w:i/>
-                <w:sz w:val="20"/>
-                <w:szCs w:val="20"/>
-              </w:rPr>
-              <w:t xml:space="preserve"> }}.</w:t>
+              <w:t>Foto 2: Ponto de captação na Estaca {{ ESTACA }}  — Lado: {{ LADO }}.</w:t>
             </w:r>
           </w:p>
         </w:tc>
@@ -6158,21 +5903,7 @@
         <w:rPr>
           <w:rFonts w:ascii="Aptos Narrow" w:hAnsi="Aptos Narrow"/>
         </w:rPr>
-        <w:t xml:space="preserve">- PE, ______ de ________________ </w:t>
-      </w:r>
-      <w:proofErr w:type="spellStart"/>
-      <w:r>
-        <w:rPr>
-          <w:rFonts w:ascii="Aptos Narrow" w:hAnsi="Aptos Narrow"/>
-        </w:rPr>
-        <w:t>de</w:t>
-      </w:r>
-      <w:proofErr w:type="spellEnd"/>
-      <w:r>
-        <w:rPr>
-          <w:rFonts w:ascii="Aptos Narrow" w:hAnsi="Aptos Narrow"/>
-        </w:rPr>
-        <w:t xml:space="preserve"> 2026.</w:t>
+        <w:t>- PE, ______ de ________________ de 2026.</w:t>
       </w:r>
     </w:p>
     <w:p>
@@ -6417,19 +6148,11 @@
                                 <w:rFonts w:ascii="Aptos Narrow" w:hAnsi="Aptos Narrow"/>
                               </w:rPr>
                             </w:pPr>
-                            <w:proofErr w:type="gramStart"/>
                             <w:r>
                               <w:rPr>
                                 <w:rFonts w:ascii="Aptos Narrow" w:hAnsi="Aptos Narrow"/>
                               </w:rPr>
-                              <w:t>{{ PROPRIETARIO</w:t>
-                            </w:r>
-                            <w:proofErr w:type="gramEnd"/>
-                            <w:r>
-                              <w:rPr>
-                                <w:rFonts w:ascii="Aptos Narrow" w:hAnsi="Aptos Narrow"/>
-                              </w:rPr>
-                              <w:t xml:space="preserve"> }}</w:t>
+                              <w:t>{{ PROPRIETARIO }}</w:t>
                             </w:r>
                             <w:r>
                               <w:rPr>
@@ -6790,16 +6513,7 @@
                               <w:sz w:val="20"/>
                               <w:szCs w:val="20"/>
                             </w:rPr>
-                            <w:t xml:space="preserve">CONTRATO </w:t>
-                          </w:r>
-                          <w:proofErr w:type="gramStart"/>
-                          <w:r>
-                            <w:rPr>
-                              <w:rFonts w:ascii="Aptos Narrow" w:hAnsi="Aptos Narrow"/>
-                              <w:sz w:val="20"/>
-                              <w:szCs w:val="20"/>
-                            </w:rPr>
-                            <w:t xml:space="preserve">{{ </w:t>
+                            <w:t xml:space="preserve">CONTRATO {{ </w:t>
                           </w:r>
                           <w:r>
                             <w:rPr>
@@ -6820,7 +6534,6 @@
                             </w:rPr>
                             <w:t>CONTRATO</w:t>
                           </w:r>
-                          <w:proofErr w:type="gramEnd"/>
                           <w:r>
                             <w:rPr>
                               <w:rFonts w:ascii="Aptos Narrow" w:hAnsi="Aptos Narrow"/>

</xml_diff>